<commit_message>
Evaristo Costa: gancho da parte 1 ajustado ao prompt mestre
Co-Authored-By: Claude Opus 5.5 <noreply@anthropic.com>
Claude-Session: https://claude.ai/code/session_01MJjUEEZrxQDEUifKK2vj9g
</commit_message>
<xml_diff>
--- a/roteiros/evaristo-costa/EvaristoCosta_Parte1_Introducao.docx
+++ b/roteiros/evaristo-costa/EvaristoCosta_Parte1_Introducao.docx
@@ -15,7 +15,7 @@
         <w:rPr>
           <w:color w:val="C00000"/>
         </w:rPr>
-        <w:t>Evaristo Costa passou treze anos sorrindo para o Brasil na hora do almoço. Anos depois, do outro lado do oceano, perdeu vinte e dois quilos em apenas três semanas.</w:t>
+        <w:t>Evaristo Costa passou treze anos sorrindo para o Brasil na hora do almoço. Longe das câmeras, numa luta cruel que quase ninguém acompanhou, perdeu vinte e dois quilos em apenas três semanas.</w:t>
       </w:r>
     </w:p>
     <w:p>
@@ -23,7 +23,7 @@
         <w:rPr>
           <w:color w:val="C00000"/>
         </w:rPr>
-        <w:t>Numa entrevista, ele resumiu o que estava vivendo em poucas palavras: "Eu me sinto definhando."</w:t>
+        <w:t>E o que pouca gente conectou é que essa queda começou com um erro. Um diagnóstico errado que custou a ele um ano inteiro.</w:t>
       </w:r>
     </w:p>
     <w:p>
@@ -31,7 +31,7 @@
         <w:rPr>
           <w:color w:val="C00000"/>
         </w:rPr>
-        <w:t>Fique até o final, porque você vai descobrir o que aconteceu com o apresentador mais querido do jornalismo brasileiro depois que ele deixou a televisão. E o que ele enfrentou longe das câmeras, enquanto o Brasil achava que ele estava apenas curtindo a vida na Inglaterra.</w:t>
+        <w:t>Fique até o final, porque você vai descobrir que erro foi esse. E o que aconteceu num sábado de janeiro, num hospital da Inglaterra, onde os médicos não sabiam dizer quando ele ia voltar para casa.</w:t>
       </w:r>
     </w:p>
     <w:p>
@@ -39,7 +39,7 @@
         <w:rPr>
           <w:color w:val="000000"/>
         </w:rPr>
-        <w:t>Para entender essa história, você precisa voltar a uma sala de aula no interior de São Paulo. Porque foi ali, em cima de uma mesa escolar, que o menino Evaristo montou o primeiro telejornal da vida dele.</w:t>
+        <w:t>Mas antes de chegar àquele hospital, você precisa conhecer o menino que transformava a mesa da escola num telejornal. Porque tudo o que Evaristo conquistou, e tudo o que ele deixou para trás, começou com o sonho de ocupar uma bancada.</w:t>
       </w:r>
     </w:p>
     <w:p>

</xml_diff>

<commit_message>
Evaristo Costa: revisão da parte 1
Co-Authored-By: Claude Opus 5.5 <noreply@anthropic.com>
Claude-Session: https://claude.ai/code/session_01MJjUEEZrxQDEUifKK2vj9g
</commit_message>
<xml_diff>
--- a/roteiros/evaristo-costa/EvaristoCosta_Parte1_Introducao.docx
+++ b/roteiros/evaristo-costa/EvaristoCosta_Parte1_Introducao.docx
@@ -15,7 +15,7 @@
         <w:rPr>
           <w:color w:val="C00000"/>
         </w:rPr>
-        <w:t>Evaristo Costa passou treze anos sorrindo para o Brasil na hora do almoço. Longe das câmeras, numa luta cruel que quase ninguém acompanhou, perdeu vinte e dois quilos em apenas três semanas.</w:t>
+        <w:t>Evaristo Costa passou treze anos sorrindo para o Brasil na hora do almoço. Longe das câmeras, numa luta cruel que o Brasil mal viu, perdeu vinte e dois quilos em apenas três semanas.</w:t>
       </w:r>
     </w:p>
     <w:p>
@@ -23,7 +23,7 @@
         <w:rPr>
           <w:color w:val="C00000"/>
         </w:rPr>
-        <w:t>E o que pouca gente conectou é que essa queda começou com um erro. Um diagnóstico errado que custou a ele um ano inteiro.</w:t>
+        <w:t>E o que pouca gente conectou é que, antes dessa queda, houve um erro. Um diagnóstico errado que custou a ele um ano inteiro.</w:t>
       </w:r>
     </w:p>
     <w:p>
@@ -87,7 +87,7 @@
         <w:rPr>
           <w:color w:val="C00000"/>
         </w:rPr>
-        <w:t>Guarde essa imagem, porque ela vai voltar. O menino que brincava de apresentar o jornal ia chegar ao topo muito antes do que imaginava. E ia descobrir, do jeito mais duro, que a luta mais difícil da vida dele estava esperando longe dela.</w:t>
+        <w:t>Guarde essa imagem, porque ela vai voltar. O menino que brincava de apresentar o jornal ia chegar ao topo com apenas vinte e sete anos. E ia descobrir, do jeito mais duro, que a luta mais difícil da vida dele estava esperando longe dela.</w:t>
       </w:r>
     </w:p>
     <w:p>
@@ -103,7 +103,7 @@
         <w:rPr>
           <w:color w:val="000000"/>
         </w:rPr>
-        <w:t>Enquanto os amigos da mesma idade pensavam em futebol e férias, ele passava horas numa cabine, controlando microfones e aprendendo como funcionava uma transmissão por dentro.</w:t>
+        <w:t>Passava horas numa cabine, controlando o som e aprendendo como uma transmissão funcionava por dentro.</w:t>
       </w:r>
     </w:p>
     <w:p>
@@ -135,7 +135,7 @@
         <w:rPr>
           <w:color w:val="000000"/>
         </w:rPr>
-        <w:t>A TV Vanguarda, afiliada da Globo no Vale do Paraíba, contratou o rapaz de São José dos Campos. Começou na produção, longe do vídeo. Depois virou repórter. E, em pouco tempo, apresentador.</w:t>
+        <w:t>A TV Vanguarda, afiliada da Globo no Vale do Paraíba, contratou o rapaz de São José dos Campos. Começou na produção, longe do vídeo. Pouco tempo depois, já aparecia na tela como repórter e apresentador.</w:t>
       </w:r>
     </w:p>
     <w:p>
@@ -183,7 +183,7 @@
         <w:rPr>
           <w:color w:val="000000"/>
         </w:rPr>
-        <w:t>Em janeiro de dois mil e um, passou a apresentar um quadro no SPTV chamado "TV Trabalho", com vagas de emprego e oportunidades de estágio. Para muita gente desempregada em São Paulo, aquele rapaz era a primeira notícia boa do dia.</w:t>
+        <w:t>Em janeiro de dois mil e um, passou a apresentar um quadro no SPTV chamado "TV Trabalho", com vagas de emprego e oportunidades de estágio. Para quem estava desempregado em São Paulo, aquele quadro podia ser a primeira notícia boa do dia.</w:t>
       </w:r>
     </w:p>
     <w:p>
@@ -199,7 +199,7 @@
         <w:rPr>
           <w:color w:val="000000"/>
         </w:rPr>
-        <w:t>Era o jeito de a Globo testar um rosto novo. Pouco tempo no ar, muita exposição. E o público gostou do que viu.</w:t>
+        <w:t>Eram poucos minutos no ar por dia, mas diante de milhões de pessoas. E o público gostou do que viu.</w:t>
       </w:r>
     </w:p>
     <w:p>

</xml_diff>